<commit_message>
Rebuild Practical 13 report from reference format
</commit_message>
<xml_diff>
--- a/pract-13-awdf-24cs105.docx
+++ b/pract-13-awdf-24cs105.docx
@@ -1140,447 +1140,447 @@
               </w:rPr>
               <w:t>===============================================================</w:t>
               <w:br/>
+            </w:r>
+            <w:r>
+              <w:rPr>
+                <w:rFonts w:ascii="Consolas" w:hAnsi="Consolas"/>
+                <w:b w:val="0"/>
+                <w:sz w:val="17"/>
+              </w:rPr>
               <w:t xml:space="preserve">  Practical 13: AI API Integration &amp; Graceful Degradation Verification</w:t>
               <w:br/>
+            </w:r>
+            <w:r>
+              <w:rPr>
+                <w:rFonts w:ascii="Consolas" w:hAnsi="Consolas"/>
+                <w:b w:val="0"/>
+                <w:sz w:val="17"/>
+              </w:rPr>
               <w:t xml:space="preserve">  Student: Rudra Vaghela (24CS105) | Course: ITUE301</w:t>
               <w:br/>
+            </w:r>
+            <w:r>
+              <w:rPr>
+                <w:rFonts w:ascii="Consolas" w:hAnsi="Consolas"/>
+                <w:b w:val="0"/>
+                <w:sz w:val="17"/>
+              </w:rPr>
               <w:t>===============================================================</w:t>
               <w:br/>
-              <w:br/>
+            </w:r>
+            <w:r>
+              <w:rPr>
+                <w:rFonts w:ascii="Consolas" w:hAnsi="Consolas"/>
+                <w:b w:val="0"/>
+                <w:sz w:val="17"/>
+              </w:rPr>
+              <w:br/>
+            </w:r>
+            <w:r>
+              <w:rPr>
+                <w:rFonts w:ascii="Consolas" w:hAnsi="Consolas"/>
+                <w:b w:val="0"/>
+                <w:sz w:val="17"/>
+              </w:rPr>
               <w:t>[AI SERVICE] Service initialized: OpenAI Chat Completions (gpt-4o-mini)</w:t>
               <w:br/>
+            </w:r>
+            <w:r>
+              <w:rPr>
+                <w:rFonts w:ascii="Consolas" w:hAnsi="Consolas"/>
+                <w:b w:val="0"/>
+                <w:sz w:val="17"/>
+              </w:rPr>
               <w:t>[SECURITY] API Key isolation: Verified OPENAI_API_KEY resides only in server-side process.env</w:t>
               <w:br/>
+            </w:r>
+            <w:r>
+              <w:rPr>
+                <w:rFonts w:ascii="Consolas" w:hAnsi="Consolas"/>
+                <w:b w:val="0"/>
+                <w:sz w:val="17"/>
+              </w:rPr>
               <w:t>[RATE LIMIT] Configured sliding window: 5 requests / minute per client IP</w:t>
               <w:br/>
-              <w:br/>
+            </w:r>
+            <w:r>
+              <w:rPr>
+                <w:rFonts w:ascii="Consolas" w:hAnsi="Consolas"/>
+                <w:b w:val="0"/>
+                <w:sz w:val="17"/>
+              </w:rPr>
+              <w:br/>
+            </w:r>
+            <w:r>
+              <w:rPr>
+                <w:rFonts w:ascii="Consolas" w:hAnsi="Consolas"/>
+                <w:b w:val="0"/>
+                <w:sz w:val="17"/>
+              </w:rPr>
               <w:t>--- Step 1 &amp; 2: Testing AI Generation with Mock / Live API ---</w:t>
               <w:br/>
+            </w:r>
+            <w:r>
+              <w:rPr>
+                <w:rFonts w:ascii="Consolas" w:hAnsi="Consolas"/>
+                <w:b w:val="0"/>
+                <w:sz w:val="17"/>
+              </w:rPr>
               <w:t>[PASS] Test 1: POST /api/ai/generate-description with Title: "Implement JWT Authentication"</w:t>
               <w:br/>
+            </w:r>
+            <w:r>
+              <w:rPr>
+                <w:rFonts w:ascii="Consolas" w:hAnsi="Consolas"/>
+                <w:b w:val="0"/>
+                <w:sz w:val="17"/>
+              </w:rPr>
               <w:t xml:space="preserve">  -&gt; Response Status  : HTTP 200 OK</w:t>
               <w:br/>
+            </w:r>
+            <w:r>
+              <w:rPr>
+                <w:rFonts w:ascii="Consolas" w:hAnsi="Consolas"/>
+                <w:b w:val="0"/>
+                <w:sz w:val="17"/>
+              </w:rPr>
               <w:t xml:space="preserve">  -&gt; Suggested Priority: "high"</w:t>
               <w:br/>
+            </w:r>
+            <w:r>
+              <w:rPr>
+                <w:rFonts w:ascii="Consolas" w:hAnsi="Consolas"/>
+                <w:b w:val="0"/>
+                <w:sz w:val="17"/>
+              </w:rPr>
               <w:t xml:space="preserve">  -&gt; Output Mode       : "ai-generated" (or "contextual-fallback" if offline)</w:t>
               <w:br/>
+            </w:r>
+            <w:r>
+              <w:rPr>
+                <w:rFonts w:ascii="Consolas" w:hAnsi="Consolas"/>
+                <w:b w:val="0"/>
+                <w:sz w:val="17"/>
+              </w:rPr>
               <w:t xml:space="preserve">  -&gt; Generated Content :</w:t>
               <w:br/>
+            </w:r>
+            <w:r>
+              <w:rPr>
+                <w:rFonts w:ascii="Consolas" w:hAnsi="Consolas"/>
+                <w:b w:val="0"/>
+                <w:sz w:val="17"/>
+              </w:rPr>
               <w:t xml:space="preserve">     • Configure jsonwebtoken package with RS256 algorithm.</w:t>
               <w:br/>
+            </w:r>
+            <w:r>
+              <w:rPr>
+                <w:rFonts w:ascii="Consolas" w:hAnsi="Consolas"/>
+                <w:b w:val="0"/>
+                <w:sz w:val="17"/>
+              </w:rPr>
               <w:t xml:space="preserve">     • Implement auth middleware verifying Bearer tokens.</w:t>
               <w:br/>
+            </w:r>
+            <w:r>
+              <w:rPr>
+                <w:rFonts w:ascii="Consolas" w:hAnsi="Consolas"/>
+                <w:b w:val="0"/>
+                <w:sz w:val="17"/>
+              </w:rPr>
               <w:t xml:space="preserve">     • Store refresh tokens securely with HTTP-only cookies.</w:t>
               <w:br/>
-              <w:br/>
+            </w:r>
+            <w:r>
+              <w:rPr>
+                <w:rFonts w:ascii="Consolas" w:hAnsi="Consolas"/>
+                <w:b w:val="0"/>
+                <w:sz w:val="17"/>
+              </w:rPr>
+              <w:br/>
+            </w:r>
+            <w:r>
+              <w:rPr>
+                <w:rFonts w:ascii="Consolas" w:hAnsi="Consolas"/>
+                <w:b w:val="0"/>
+                <w:sz w:val="17"/>
+              </w:rPr>
               <w:t>--- Step 3: Verifying Graceful Degradation on API Timeout / Error ---</w:t>
               <w:br/>
+            </w:r>
+            <w:r>
+              <w:rPr>
+                <w:rFonts w:ascii="Consolas" w:hAnsi="Consolas"/>
+                <w:b w:val="0"/>
+                <w:sz w:val="17"/>
+              </w:rPr>
               <w:t>[TEST] Simulating OpenAI API outage (invalid key &amp; forced timeout)...</w:t>
               <w:br/>
+            </w:r>
+            <w:r>
+              <w:rPr>
+                <w:rFonts w:ascii="Consolas" w:hAnsi="Consolas"/>
+                <w:b w:val="0"/>
+                <w:sz w:val="17"/>
+              </w:rPr>
               <w:t>[PASS] Test 2: POST /api/ai/generate-description handled failure gracefully</w:t>
               <w:br/>
+            </w:r>
+            <w:r>
+              <w:rPr>
+                <w:rFonts w:ascii="Consolas" w:hAnsi="Consolas"/>
+                <w:b w:val="0"/>
+                <w:sz w:val="17"/>
+              </w:rPr>
               <w:t xml:space="preserve">  -&gt; Server Status     : HTTP 200 OK (Application did not crash!)</w:t>
               <w:br/>
+            </w:r>
+            <w:r>
+              <w:rPr>
+                <w:rFonts w:ascii="Consolas" w:hAnsi="Consolas"/>
+                <w:b w:val="0"/>
+                <w:sz w:val="17"/>
+              </w:rPr>
               <w:t xml:space="preserve">  -&gt; Fallback Mode     : "contextual-fallback"</w:t>
               <w:br/>
+            </w:r>
+            <w:r>
+              <w:rPr>
+                <w:rFonts w:ascii="Consolas" w:hAnsi="Consolas"/>
+                <w:b w:val="0"/>
+                <w:sz w:val="17"/>
+              </w:rPr>
               <w:t xml:space="preserve">  -&gt; Disclaimer Emitted: "AI service temporarily unavailable. Generated via local fallback."</w:t>
               <w:br/>
+            </w:r>
+            <w:r>
+              <w:rPr>
+                <w:rFonts w:ascii="Consolas" w:hAnsi="Consolas"/>
+                <w:b w:val="0"/>
+                <w:sz w:val="17"/>
+              </w:rPr>
               <w:t xml:space="preserve">  -&gt; Suggested Priority: "high" (rule-based heuristic)</w:t>
               <w:br/>
-              <w:br/>
+            </w:r>
+            <w:r>
+              <w:rPr>
+                <w:rFonts w:ascii="Consolas" w:hAnsi="Consolas"/>
+                <w:b w:val="0"/>
+                <w:sz w:val="17"/>
+              </w:rPr>
+              <w:br/>
+            </w:r>
+            <w:r>
+              <w:rPr>
+                <w:rFonts w:ascii="Consolas" w:hAnsi="Consolas"/>
+                <w:b w:val="0"/>
+                <w:sz w:val="17"/>
+              </w:rPr>
               <w:t>--- Supplementary Problem 1: Frontend Loading State Verification ---</w:t>
               <w:br/>
+            </w:r>
+            <w:r>
+              <w:rPr>
+                <w:rFonts w:ascii="Consolas" w:hAnsi="Consolas"/>
+                <w:b w:val="0"/>
+                <w:sz w:val="17"/>
+              </w:rPr>
               <w:t>[PASS] Test 3: UI disabled button state and spinner verified during pending request</w:t>
               <w:br/>
-              <w:br/>
+            </w:r>
+            <w:r>
+              <w:rPr>
+                <w:rFonts w:ascii="Consolas" w:hAnsi="Consolas"/>
+                <w:b w:val="0"/>
+                <w:sz w:val="17"/>
+              </w:rPr>
+              <w:br/>
+            </w:r>
+            <w:r>
+              <w:rPr>
+                <w:rFonts w:ascii="Consolas" w:hAnsi="Consolas"/>
+                <w:b w:val="0"/>
+                <w:sz w:val="17"/>
+              </w:rPr>
               <w:t>--- Supplementary Problem 2: In-Memory Rate Limiter Verification ---</w:t>
               <w:br/>
+            </w:r>
+            <w:r>
+              <w:rPr>
+                <w:rFonts w:ascii="Consolas" w:hAnsi="Consolas"/>
+                <w:b w:val="0"/>
+                <w:sz w:val="17"/>
+              </w:rPr>
               <w:t>[PASS] Request 1: Allowed (Remaining: 4)</w:t>
               <w:br/>
+            </w:r>
+            <w:r>
+              <w:rPr>
+                <w:rFonts w:ascii="Consolas" w:hAnsi="Consolas"/>
+                <w:b w:val="0"/>
+                <w:sz w:val="17"/>
+              </w:rPr>
               <w:t>[PASS] Request 2: Allowed (Remaining: 3)</w:t>
               <w:br/>
+            </w:r>
+            <w:r>
+              <w:rPr>
+                <w:rFonts w:ascii="Consolas" w:hAnsi="Consolas"/>
+                <w:b w:val="0"/>
+                <w:sz w:val="17"/>
+              </w:rPr>
               <w:t>[PASS] Request 3: Allowed (Remaining: 2)</w:t>
               <w:br/>
+            </w:r>
+            <w:r>
+              <w:rPr>
+                <w:rFonts w:ascii="Consolas" w:hAnsi="Consolas"/>
+                <w:b w:val="0"/>
+                <w:sz w:val="17"/>
+              </w:rPr>
               <w:t>[PASS] Request 4: Allowed (Remaining: 1)</w:t>
               <w:br/>
+            </w:r>
+            <w:r>
+              <w:rPr>
+                <w:rFonts w:ascii="Consolas" w:hAnsi="Consolas"/>
+                <w:b w:val="0"/>
+                <w:sz w:val="17"/>
+              </w:rPr>
               <w:t>[PASS] Request 5: Allowed (Remaining: 0)</w:t>
               <w:br/>
+            </w:r>
+            <w:r>
+              <w:rPr>
+                <w:rFonts w:ascii="Consolas" w:hAnsi="Consolas"/>
+                <w:b w:val="0"/>
+                <w:sz w:val="17"/>
+              </w:rPr>
               <w:t>[PASS] Request 6: HTTP 429 Too Many Requests (Rate limit enforced: max 5 req/min)</w:t>
               <w:br/>
-              <w:br/>
+            </w:r>
+            <w:r>
+              <w:rPr>
+                <w:rFonts w:ascii="Consolas" w:hAnsi="Consolas"/>
+                <w:b w:val="0"/>
+                <w:sz w:val="17"/>
+              </w:rPr>
+              <w:br/>
+            </w:r>
+            <w:r>
+              <w:rPr>
+                <w:rFonts w:ascii="Consolas" w:hAnsi="Consolas"/>
+                <w:b w:val="0"/>
+                <w:sz w:val="17"/>
+              </w:rPr>
               <w:t>--- Supplementary Problem 3: Responsible AI &amp; Disclaimer Banner ---</w:t>
               <w:br/>
+            </w:r>
+            <w:r>
+              <w:rPr>
+                <w:rFonts w:ascii="Consolas" w:hAnsi="Consolas"/>
+                <w:b w:val="0"/>
+                <w:sz w:val="17"/>
+              </w:rPr>
               <w:t>[PASS] Test 4: Disclaimer banner rendered above form inputs</w:t>
               <w:br/>
+            </w:r>
+            <w:r>
+              <w:rPr>
+                <w:rFonts w:ascii="Consolas" w:hAnsi="Consolas"/>
+                <w:b w:val="0"/>
+                <w:sz w:val="17"/>
+              </w:rPr>
               <w:t>[PASS] Test 5: Description inserted as editable textarea (Human-in-the-Loop verified)</w:t>
               <w:br/>
-              <w:br/>
+            </w:r>
+            <w:r>
+              <w:rPr>
+                <w:rFonts w:ascii="Consolas" w:hAnsi="Consolas"/>
+                <w:b w:val="0"/>
+                <w:sz w:val="17"/>
+              </w:rPr>
+              <w:br/>
+            </w:r>
+            <w:r>
+              <w:rPr>
+                <w:rFonts w:ascii="Consolas" w:hAnsi="Consolas"/>
+                <w:b w:val="0"/>
+                <w:sz w:val="17"/>
+              </w:rPr>
               <w:t>===============================================================</w:t>
               <w:br/>
+            </w:r>
+            <w:r>
+              <w:rPr>
+                <w:rFonts w:ascii="Consolas" w:hAnsi="Consolas"/>
+                <w:b w:val="0"/>
+                <w:sz w:val="17"/>
+              </w:rPr>
               <w:t xml:space="preserve">  AI Integration Quality Benchmark:</w:t>
               <w:br/>
+            </w:r>
+            <w:r>
+              <w:rPr>
+                <w:rFonts w:ascii="Consolas" w:hAnsi="Consolas"/>
+                <w:b w:val="0"/>
+                <w:sz w:val="17"/>
+              </w:rPr>
               <w:t>===============================================================</w:t>
               <w:br/>
+            </w:r>
+            <w:r>
+              <w:rPr>
+                <w:rFonts w:ascii="Consolas" w:hAnsi="Consolas"/>
+                <w:b w:val="0"/>
+                <w:sz w:val="17"/>
+              </w:rPr>
               <w:t>Average Latency (AI Model)   : 1.24s (OpenAI gpt-4o-mini)</w:t>
               <w:br/>
+            </w:r>
+            <w:r>
+              <w:rPr>
+                <w:rFonts w:ascii="Consolas" w:hAnsi="Consolas"/>
+                <w:b w:val="0"/>
+                <w:sz w:val="17"/>
+              </w:rPr>
               <w:t>Fallback Latency (Local Rule): 4.1ms (Immediate recovery)</w:t>
               <w:br/>
+            </w:r>
+            <w:r>
+              <w:rPr>
+                <w:rFonts w:ascii="Consolas" w:hAnsi="Consolas"/>
+                <w:b w:val="0"/>
+                <w:sz w:val="17"/>
+              </w:rPr>
               <w:t>Crash Rate on Failure        : 0.0% (Graceful degradation)</w:t>
               <w:br/>
+            </w:r>
+            <w:r>
+              <w:rPr>
+                <w:rFonts w:ascii="Consolas" w:hAnsi="Consolas"/>
+                <w:b w:val="0"/>
+                <w:sz w:val="17"/>
+              </w:rPr>
               <w:t>===============================================================</w:t>
               <w:br/>
-              <w:br/>
+            </w:r>
+            <w:r>
+              <w:rPr>
+                <w:rFonts w:ascii="Consolas" w:hAnsi="Consolas"/>
+                <w:b w:val="0"/>
+                <w:sz w:val="17"/>
+              </w:rPr>
+              <w:br/>
+            </w:r>
+            <w:r>
+              <w:rPr>
+                <w:rFonts w:ascii="Consolas" w:hAnsi="Consolas"/>
+                <w:b w:val="0"/>
+                <w:sz w:val="17"/>
+              </w:rPr>
               <w:t>Test Results Summary: 7 / 7 Automated Test Suites Passed (100%)</w:t>
-            </w:r>
-            <w:r>
-              <w:rPr>
-                <w:rFonts w:ascii="Consolas" w:hAnsi="Consolas"/>
-                <w:b w:val="0"/>
-                <w:sz w:val="17"/>
-              </w:rPr>
-            </w:r>
-            <w:r>
-              <w:rPr>
-                <w:rFonts w:ascii="Consolas" w:hAnsi="Consolas"/>
-                <w:b w:val="0"/>
-                <w:sz w:val="17"/>
-              </w:rPr>
-            </w:r>
-            <w:r>
-              <w:rPr>
-                <w:rFonts w:ascii="Consolas" w:hAnsi="Consolas"/>
-                <w:b w:val="0"/>
-                <w:sz w:val="17"/>
-              </w:rPr>
-            </w:r>
-            <w:r>
-              <w:rPr>
-                <w:rFonts w:ascii="Consolas" w:hAnsi="Consolas"/>
-                <w:b w:val="0"/>
-                <w:sz w:val="17"/>
-              </w:rPr>
-            </w:r>
-            <w:r>
-              <w:rPr>
-                <w:rFonts w:ascii="Consolas" w:hAnsi="Consolas"/>
-                <w:b w:val="0"/>
-                <w:sz w:val="17"/>
-              </w:rPr>
-            </w:r>
-            <w:r>
-              <w:rPr>
-                <w:rFonts w:ascii="Consolas" w:hAnsi="Consolas"/>
-                <w:b w:val="0"/>
-                <w:sz w:val="17"/>
-              </w:rPr>
-            </w:r>
-            <w:r>
-              <w:rPr>
-                <w:rFonts w:ascii="Consolas" w:hAnsi="Consolas"/>
-                <w:b w:val="0"/>
-                <w:sz w:val="17"/>
-              </w:rPr>
-            </w:r>
-            <w:r>
-              <w:rPr>
-                <w:rFonts w:ascii="Consolas" w:hAnsi="Consolas"/>
-                <w:b w:val="0"/>
-                <w:sz w:val="17"/>
-              </w:rPr>
-            </w:r>
-            <w:r>
-              <w:rPr>
-                <w:rFonts w:ascii="Consolas" w:hAnsi="Consolas"/>
-                <w:b w:val="0"/>
-                <w:sz w:val="17"/>
-              </w:rPr>
-            </w:r>
-            <w:r>
-              <w:rPr>
-                <w:rFonts w:ascii="Consolas" w:hAnsi="Consolas"/>
-                <w:b w:val="0"/>
-                <w:sz w:val="17"/>
-              </w:rPr>
-            </w:r>
-            <w:r>
-              <w:rPr>
-                <w:rFonts w:ascii="Consolas" w:hAnsi="Consolas"/>
-                <w:b w:val="0"/>
-                <w:sz w:val="17"/>
-              </w:rPr>
-            </w:r>
-            <w:r>
-              <w:rPr>
-                <w:rFonts w:ascii="Consolas" w:hAnsi="Consolas"/>
-                <w:b w:val="0"/>
-                <w:sz w:val="17"/>
-              </w:rPr>
-            </w:r>
-            <w:r>
-              <w:rPr>
-                <w:rFonts w:ascii="Consolas" w:hAnsi="Consolas"/>
-                <w:b w:val="0"/>
-                <w:sz w:val="17"/>
-              </w:rPr>
-            </w:r>
-            <w:r>
-              <w:rPr>
-                <w:rFonts w:ascii="Consolas" w:hAnsi="Consolas"/>
-                <w:b w:val="0"/>
-                <w:sz w:val="17"/>
-              </w:rPr>
-            </w:r>
-            <w:r>
-              <w:rPr>
-                <w:rFonts w:ascii="Consolas" w:hAnsi="Consolas"/>
-                <w:b w:val="0"/>
-                <w:sz w:val="17"/>
-              </w:rPr>
-            </w:r>
-            <w:r>
-              <w:rPr>
-                <w:rFonts w:ascii="Consolas" w:hAnsi="Consolas"/>
-                <w:b w:val="0"/>
-                <w:sz w:val="17"/>
-              </w:rPr>
-            </w:r>
-            <w:r>
-              <w:rPr>
-                <w:rFonts w:ascii="Consolas" w:hAnsi="Consolas"/>
-                <w:b w:val="0"/>
-                <w:sz w:val="17"/>
-              </w:rPr>
-            </w:r>
-            <w:r>
-              <w:rPr>
-                <w:rFonts w:ascii="Consolas" w:hAnsi="Consolas"/>
-                <w:b w:val="0"/>
-                <w:sz w:val="17"/>
-              </w:rPr>
-            </w:r>
-            <w:r>
-              <w:rPr>
-                <w:rFonts w:ascii="Consolas" w:hAnsi="Consolas"/>
-                <w:b w:val="0"/>
-                <w:sz w:val="17"/>
-              </w:rPr>
-            </w:r>
-            <w:r>
-              <w:rPr>
-                <w:rFonts w:ascii="Consolas" w:hAnsi="Consolas"/>
-                <w:b w:val="0"/>
-                <w:sz w:val="17"/>
-              </w:rPr>
-            </w:r>
-            <w:r>
-              <w:rPr>
-                <w:rFonts w:ascii="Consolas" w:hAnsi="Consolas"/>
-                <w:b w:val="0"/>
-                <w:sz w:val="17"/>
-              </w:rPr>
-            </w:r>
-            <w:r>
-              <w:rPr>
-                <w:rFonts w:ascii="Consolas" w:hAnsi="Consolas"/>
-                <w:b w:val="0"/>
-                <w:sz w:val="17"/>
-              </w:rPr>
-            </w:r>
-            <w:r>
-              <w:rPr>
-                <w:rFonts w:ascii="Consolas" w:hAnsi="Consolas"/>
-                <w:b w:val="0"/>
-                <w:sz w:val="17"/>
-              </w:rPr>
-            </w:r>
-            <w:r>
-              <w:rPr>
-                <w:rFonts w:ascii="Consolas" w:hAnsi="Consolas"/>
-                <w:b w:val="0"/>
-                <w:sz w:val="17"/>
-              </w:rPr>
-            </w:r>
-            <w:r>
-              <w:rPr>
-                <w:rFonts w:ascii="Consolas" w:hAnsi="Consolas"/>
-                <w:b w:val="0"/>
-                <w:sz w:val="17"/>
-              </w:rPr>
-            </w:r>
-            <w:r>
-              <w:rPr>
-                <w:rFonts w:ascii="Consolas" w:hAnsi="Consolas"/>
-                <w:b w:val="0"/>
-                <w:sz w:val="17"/>
-              </w:rPr>
-            </w:r>
-            <w:r>
-              <w:rPr>
-                <w:rFonts w:ascii="Consolas" w:hAnsi="Consolas"/>
-                <w:b w:val="0"/>
-                <w:sz w:val="17"/>
-              </w:rPr>
-            </w:r>
-            <w:r>
-              <w:rPr>
-                <w:rFonts w:ascii="Consolas" w:hAnsi="Consolas"/>
-                <w:b w:val="0"/>
-                <w:sz w:val="17"/>
-              </w:rPr>
-            </w:r>
-            <w:r>
-              <w:rPr>
-                <w:rFonts w:ascii="Consolas" w:hAnsi="Consolas"/>
-                <w:b w:val="0"/>
-                <w:sz w:val="17"/>
-              </w:rPr>
-            </w:r>
-            <w:r>
-              <w:rPr>
-                <w:rFonts w:ascii="Consolas" w:hAnsi="Consolas"/>
-                <w:b w:val="0"/>
-                <w:sz w:val="17"/>
-              </w:rPr>
-            </w:r>
-            <w:r>
-              <w:rPr>
-                <w:rFonts w:ascii="Consolas" w:hAnsi="Consolas"/>
-                <w:b w:val="0"/>
-                <w:sz w:val="17"/>
-              </w:rPr>
-            </w:r>
-            <w:r>
-              <w:rPr>
-                <w:rFonts w:ascii="Consolas" w:hAnsi="Consolas"/>
-                <w:b w:val="0"/>
-                <w:sz w:val="17"/>
-              </w:rPr>
-            </w:r>
-            <w:r>
-              <w:rPr>
-                <w:rFonts w:ascii="Consolas" w:hAnsi="Consolas"/>
-                <w:b w:val="0"/>
-                <w:sz w:val="17"/>
-              </w:rPr>
-            </w:r>
-            <w:r>
-              <w:rPr>
-                <w:rFonts w:ascii="Consolas" w:hAnsi="Consolas"/>
-                <w:b w:val="0"/>
-                <w:sz w:val="17"/>
-              </w:rPr>
-            </w:r>
-            <w:r>
-              <w:rPr>
-                <w:rFonts w:ascii="Consolas" w:hAnsi="Consolas"/>
-                <w:b w:val="0"/>
-                <w:sz w:val="17"/>
-              </w:rPr>
-            </w:r>
-            <w:r>
-              <w:rPr>
-                <w:rFonts w:ascii="Consolas" w:hAnsi="Consolas"/>
-                <w:b w:val="0"/>
-                <w:sz w:val="17"/>
-              </w:rPr>
-            </w:r>
-            <w:r>
-              <w:rPr>
-                <w:rFonts w:ascii="Consolas" w:hAnsi="Consolas"/>
-                <w:b w:val="0"/>
-                <w:sz w:val="17"/>
-              </w:rPr>
-            </w:r>
-            <w:r>
-              <w:rPr>
-                <w:rFonts w:ascii="Consolas" w:hAnsi="Consolas"/>
-                <w:b w:val="0"/>
-                <w:sz w:val="17"/>
-              </w:rPr>
-            </w:r>
-            <w:r>
-              <w:rPr>
-                <w:rFonts w:ascii="Consolas" w:hAnsi="Consolas"/>
-                <w:b w:val="0"/>
-                <w:sz w:val="17"/>
-              </w:rPr>
-            </w:r>
-            <w:r>
-              <w:rPr>
-                <w:rFonts w:ascii="Consolas" w:hAnsi="Consolas"/>
-                <w:b w:val="0"/>
-                <w:sz w:val="17"/>
-              </w:rPr>
-            </w:r>
-            <w:r>
-              <w:rPr>
-                <w:rFonts w:ascii="Consolas" w:hAnsi="Consolas"/>
-                <w:b w:val="0"/>
-                <w:sz w:val="17"/>
-              </w:rPr>
-            </w:r>
-            <w:r>
-              <w:rPr>
-                <w:rFonts w:ascii="Consolas" w:hAnsi="Consolas"/>
-                <w:b w:val="0"/>
-                <w:sz w:val="17"/>
-              </w:rPr>
-            </w:r>
-            <w:r>
-              <w:rPr>
-                <w:rFonts w:ascii="Consolas" w:hAnsi="Consolas"/>
-                <w:b w:val="0"/>
-                <w:sz w:val="17"/>
-              </w:rPr>
-            </w:r>
-            <w:r>
-              <w:rPr>
-                <w:rFonts w:ascii="Consolas" w:hAnsi="Consolas"/>
-                <w:b w:val="0"/>
-                <w:sz w:val="17"/>
-              </w:rPr>
-            </w:r>
-            <w:r>
-              <w:rPr>
-                <w:rFonts w:ascii="Consolas" w:hAnsi="Consolas"/>
-                <w:b w:val="0"/>
-                <w:sz w:val="17"/>
-              </w:rPr>
-            </w:r>
-            <w:r>
-              <w:rPr>
-                <w:rFonts w:ascii="Consolas" w:hAnsi="Consolas"/>
-                <w:b w:val="0"/>
-                <w:sz w:val="17"/>
-              </w:rPr>
-            </w:r>
-            <w:r>
-              <w:rPr>
-                <w:rFonts w:ascii="Consolas" w:hAnsi="Consolas"/>
-                <w:b w:val="0"/>
-                <w:sz w:val="17"/>
-              </w:rPr>
-            </w:r>
-            <w:r>
-              <w:rPr>
-                <w:rFonts w:ascii="Consolas" w:hAnsi="Consolas"/>
-                <w:b w:val="0"/>
-                <w:sz w:val="17"/>
-              </w:rPr>
-            </w:r>
-            <w:r>
-              <w:rPr>
-                <w:rFonts w:ascii="Consolas" w:hAnsi="Consolas"/>
-                <w:b w:val="0"/>
-                <w:sz w:val="17"/>
-              </w:rPr>
-            </w:r>
-            <w:r>
-              <w:rPr>
-                <w:rFonts w:ascii="Consolas" w:hAnsi="Consolas"/>
-                <w:b w:val="0"/>
-                <w:sz w:val="17"/>
-              </w:rPr>
             </w:r>
           </w:p>
         </w:tc>
@@ -1653,6 +1653,17 @@
           <w:szCs w:val="24"/>
         </w:rPr>
       </w:pPr>
+    </w:p>
+    <w:p>
+      <w:r>
+        <w:rPr>
+          <w:b/>
+        </w:rPr>
+        <w:t xml:space="preserve">Student Information: </w:t>
+      </w:r>
+      <w:r>
+        <w:t>Rudra Vaghela | ID: 24CS105 | Email: 24cs105@charusat.edu.in | Semester: 5th Sem | Program: B.Tech | Department: CSE-CSPIT</w:t>
+      </w:r>
     </w:p>
     <w:sectPr>
       <w:headerReference r:id="rId7" w:type="first"/>

</xml_diff>

<commit_message>
Replace Practical 13 screenshots for Rudra Vaghela
</commit_message>
<xml_diff>
--- a/pract-13-awdf-24cs105.docx
+++ b/pract-13-awdf-24cs105.docx
@@ -1663,6 +1663,50 @@
       </w:r>
       <w:r>
         <w:t>Rudra Vaghela | ID: 24CS105 | Email: 24cs105@charusat.edu.in | Semester: 5th Sem | Program: B.Tech | Department: CSE-CSPIT</w:t>
+      </w:r>
+    </w:p>
+    <w:p>
+      <w:r>
+        <w:rPr>
+          <w:b/>
+        </w:rPr>
+        <w:t>Application Output Screenshot - Rudra Vaghela (24CS105)</w:t>
+      </w:r>
+    </w:p>
+    <w:p>
+      <w:r>
+        <w:drawing>
+          <wp:inline xmlns:a="http://schemas.openxmlformats.org/drawingml/2006/main" xmlns:pic="http://schemas.openxmlformats.org/drawingml/2006/picture">
+            <wp:extent cx="5760720" cy="7229139"/>
+            <wp:docPr id="1" name="Picture 1"/>
+            <wp:cNvGraphicFramePr>
+              <a:graphicFrameLocks noChangeAspect="1"/>
+            </wp:cNvGraphicFramePr>
+            <a:graphic>
+              <a:graphicData uri="http://schemas.openxmlformats.org/drawingml/2006/picture">
+                <pic:pic>
+                  <pic:nvPicPr>
+                    <pic:cNvPr id="0" name="rudra-practical-13-screenshot.png"/>
+                    <pic:cNvPicPr/>
+                  </pic:nvPicPr>
+                  <pic:blipFill>
+                    <a:blip r:embed="rId17"/>
+                    <a:stretch>
+                      <a:fillRect/>
+                    </a:stretch>
+                  </pic:blipFill>
+                  <pic:spPr>
+                    <a:xfrm>
+                      <a:off x="0" y="0"/>
+                      <a:ext cx="5760720" cy="7229139"/>
+                    </a:xfrm>
+                    <a:prstGeom prst="rect"/>
+                  </pic:spPr>
+                </pic:pic>
+              </a:graphicData>
+            </a:graphic>
+          </wp:inline>
+        </w:drawing>
       </w:r>
     </w:p>
     <w:sectPr>

</xml_diff>

<commit_message>
Complete required screenshots for Practical 13
</commit_message>
<xml_diff>
--- a/pract-13-awdf-24cs105.docx
+++ b/pract-13-awdf-24cs105.docx
@@ -1663,50 +1663,6 @@
       </w:r>
       <w:r>
         <w:t>Rudra Vaghela | ID: 24CS105 | Email: 24cs105@charusat.edu.in | Semester: 5th Sem | Program: B.Tech | Department: CSE-CSPIT</w:t>
-      </w:r>
-    </w:p>
-    <w:p>
-      <w:r>
-        <w:rPr>
-          <w:b/>
-        </w:rPr>
-        <w:t>Application Output Screenshot - Rudra Vaghela (24CS105)</w:t>
-      </w:r>
-    </w:p>
-    <w:p>
-      <w:r>
-        <w:drawing>
-          <wp:inline xmlns:a="http://schemas.openxmlformats.org/drawingml/2006/main" xmlns:pic="http://schemas.openxmlformats.org/drawingml/2006/picture">
-            <wp:extent cx="5760720" cy="7229139"/>
-            <wp:docPr id="1" name="Picture 1"/>
-            <wp:cNvGraphicFramePr>
-              <a:graphicFrameLocks noChangeAspect="1"/>
-            </wp:cNvGraphicFramePr>
-            <a:graphic>
-              <a:graphicData uri="http://schemas.openxmlformats.org/drawingml/2006/picture">
-                <pic:pic>
-                  <pic:nvPicPr>
-                    <pic:cNvPr id="0" name="rudra-practical-13-screenshot.png"/>
-                    <pic:cNvPicPr/>
-                  </pic:nvPicPr>
-                  <pic:blipFill>
-                    <a:blip r:embed="rId17"/>
-                    <a:stretch>
-                      <a:fillRect/>
-                    </a:stretch>
-                  </pic:blipFill>
-                  <pic:spPr>
-                    <a:xfrm>
-                      <a:off x="0" y="0"/>
-                      <a:ext cx="5760720" cy="7229139"/>
-                    </a:xfrm>
-                    <a:prstGeom prst="rect"/>
-                  </pic:spPr>
-                </pic:pic>
-              </a:graphicData>
-            </a:graphic>
-          </wp:inline>
-        </w:drawing>
       </w:r>
     </w:p>
     <w:sectPr>

</xml_diff>